<commit_message>
fix: template de notificação itera lista de fiadores (multi-avalista)
O bloco AVALISTA(S) do com_fiador.docx referenciava um fiador fixo (campos
de nível raiz), então só renderizava um avalista mesmo quando o devedor
tinha vários. Agora o bloco está dentro de um loop docxtpl
{%p for f in fiadores %} ... {%p endfor %}, gerando um bloco por fiador.

Depende de o payload trazer `fiadores` como lista com os campos de endereço
por fiador (agregação feita no n8n). Verificado por render: 3 fiadores -> 3
blocos; 1 fiador -> 1 bloco; formatação preservada.

Co-Authored-By: Claude Opus 4.8 (1M context) <noreply@anthropic.com>
</commit_message>
<xml_diff>
--- a/templates/notificacao/com_fiador.docx
+++ b/templates/notificacao/com_fiador.docx
@@ -816,91 +816,23 @@
     </w:p>
     <w:p>
       <w:pPr>
-        <w:rPr>
-          <w:b/>
+        <w:pStyle w:val="Standard"/>
+        <w:jc w:val="both"/>
+        <w:rPr>
+          <w:rFonts w:ascii="Arial" w:hAnsi="Arial"/>
+          <w:b/>
+          <w:color w:val="000000"/>
+          <w:sz w:val="20"/>
         </w:rPr>
       </w:pPr>
       <w:r>
         <w:rPr>
-          <w:b/>
-        </w:rPr>
-        <w:t xml:space="preserve">AVALISTA(S): Nome: </w:t>
-      </w:r>
-      <w:proofErr w:type="gramStart"/>
-      <w:r>
-        <w:rPr>
-          <w:b/>
-        </w:rPr>
-        <w:t>{{ Fiador</w:t>
-      </w:r>
-      <w:proofErr w:type="gramEnd"/>
-      <w:r>
-        <w:rPr>
-          <w:b/>
-        </w:rPr>
-        <w:t xml:space="preserve"> }} </w:t>
-      </w:r>
-      <w:r>
-        <w:rPr>
-          <w:rFonts w:ascii="Arial" w:hAnsi="Arial"/>
-          <w:b/>
-          <w:sz w:val="20"/>
-        </w:rPr>
-        <w:t xml:space="preserve">- </w:t>
-      </w:r>
-      <w:r>
-        <w:rPr>
-          <w:b/>
-        </w:rPr>
-        <w:t>CPF:</w:t>
-      </w:r>
-      <w:r>
-        <w:rPr>
-          <w:b/>
-        </w:rPr>
-        <w:t xml:space="preserve"> </w:t>
-      </w:r>
-      <w:proofErr w:type="gramStart"/>
-      <w:r>
-        <w:rPr>
-          <w:b/>
-        </w:rPr>
-        <w:t xml:space="preserve">{{ </w:t>
-      </w:r>
-      <w:proofErr w:type="spellStart"/>
-      <w:r>
-        <w:rPr>
-          <w:b/>
-        </w:rPr>
-        <w:t>fiador</w:t>
-      </w:r>
-      <w:proofErr w:type="gramEnd"/>
-      <w:r>
-        <w:rPr>
-          <w:b/>
-        </w:rPr>
-        <w:t>_</w:t>
-      </w:r>
-      <w:proofErr w:type="gramStart"/>
-      <w:r>
-        <w:rPr>
-          <w:b/>
-        </w:rPr>
-        <w:t>cpf</w:t>
-      </w:r>
-      <w:proofErr w:type="spellEnd"/>
-      <w:r>
-        <w:rPr>
-          <w:b/>
-        </w:rPr>
-        <w:t xml:space="preserve"> }</w:t>
-      </w:r>
-      <w:proofErr w:type="gramEnd"/>
-      <w:r>
-        <w:rPr>
-          <w:b/>
-        </w:rPr>
-        <w:t>}</w:t>
+          <w:rFonts w:ascii="Arial" w:hAnsi="Arial"/>
+          <w:b/>
+          <w:color w:val="000000"/>
+          <w:sz w:val="20"/>
+        </w:rPr>
+        <w:t xml:space="preserve">{%p for f in fiadores %}</w:t>
       </w:r>
     </w:p>
     <w:p>
@@ -914,503 +846,68 @@
           <w:sz w:val="20"/>
         </w:rPr>
       </w:pPr>
-      <w:proofErr w:type="gramStart"/>
-      <w:r>
-        <w:rPr>
-          <w:rFonts w:ascii="Arial" w:hAnsi="Arial"/>
-          <w:b/>
-          <w:color w:val="000000"/>
-          <w:sz w:val="20"/>
-        </w:rPr>
-        <w:t xml:space="preserve">{{ </w:t>
-      </w:r>
-      <w:proofErr w:type="spellStart"/>
-      <w:r>
-        <w:rPr>
-          <w:rFonts w:ascii="Arial" w:hAnsi="Arial"/>
-          <w:b/>
-          <w:color w:val="000000"/>
-          <w:sz w:val="20"/>
-        </w:rPr>
-        <w:t>fiador</w:t>
-      </w:r>
-      <w:proofErr w:type="gramEnd"/>
-      <w:r>
-        <w:rPr>
-          <w:rFonts w:ascii="Arial" w:hAnsi="Arial"/>
-          <w:b/>
-          <w:color w:val="000000"/>
-          <w:sz w:val="20"/>
-        </w:rPr>
-        <w:t>_</w:t>
-      </w:r>
-      <w:proofErr w:type="gramStart"/>
-      <w:r>
-        <w:rPr>
-          <w:rFonts w:ascii="Arial" w:hAnsi="Arial"/>
-          <w:b/>
-          <w:color w:val="000000"/>
-          <w:sz w:val="20"/>
-        </w:rPr>
-        <w:t>endereco</w:t>
-      </w:r>
-      <w:proofErr w:type="spellEnd"/>
-      <w:r>
-        <w:rPr>
-          <w:rFonts w:ascii="Arial" w:hAnsi="Arial"/>
-          <w:b/>
-          <w:color w:val="000000"/>
-          <w:sz w:val="20"/>
-        </w:rPr>
-        <w:t xml:space="preserve"> }</w:t>
-      </w:r>
-      <w:proofErr w:type="gramEnd"/>
-      <w:r>
-        <w:rPr>
-          <w:rFonts w:ascii="Arial" w:hAnsi="Arial"/>
-          <w:b/>
-          <w:color w:val="000000"/>
-          <w:sz w:val="20"/>
-        </w:rPr>
-        <w:t xml:space="preserve">}, nº </w:t>
-      </w:r>
-      <w:proofErr w:type="gramStart"/>
-      <w:r>
-        <w:rPr>
-          <w:rFonts w:ascii="Arial" w:hAnsi="Arial"/>
-          <w:b/>
-          <w:color w:val="000000"/>
-          <w:sz w:val="20"/>
-        </w:rPr>
-        <w:t xml:space="preserve">{{ </w:t>
-      </w:r>
-      <w:proofErr w:type="spellStart"/>
-      <w:r>
-        <w:rPr>
-          <w:rFonts w:ascii="Arial" w:hAnsi="Arial"/>
-          <w:b/>
-          <w:color w:val="000000"/>
-          <w:sz w:val="20"/>
-        </w:rPr>
-        <w:t>fiador</w:t>
-      </w:r>
-      <w:proofErr w:type="gramEnd"/>
-      <w:r>
-        <w:rPr>
-          <w:rFonts w:ascii="Arial" w:hAnsi="Arial"/>
-          <w:b/>
-          <w:color w:val="000000"/>
-          <w:sz w:val="20"/>
-        </w:rPr>
-        <w:t>_num_</w:t>
-      </w:r>
-      <w:proofErr w:type="gramStart"/>
-      <w:r>
-        <w:rPr>
-          <w:rFonts w:ascii="Arial" w:hAnsi="Arial"/>
-          <w:b/>
-          <w:color w:val="000000"/>
-          <w:sz w:val="20"/>
-        </w:rPr>
-        <w:t>endereco</w:t>
-      </w:r>
-      <w:proofErr w:type="spellEnd"/>
-      <w:r>
-        <w:rPr>
-          <w:rFonts w:ascii="Arial" w:hAnsi="Arial"/>
-          <w:b/>
-          <w:color w:val="000000"/>
-          <w:sz w:val="20"/>
-        </w:rPr>
-        <w:t xml:space="preserve"> }}{</w:t>
-      </w:r>
-      <w:proofErr w:type="gramEnd"/>
-      <w:r>
-        <w:rPr>
-          <w:rFonts w:ascii="Arial" w:hAnsi="Arial"/>
-          <w:b/>
-          <w:color w:val="000000"/>
-          <w:sz w:val="20"/>
-        </w:rPr>
-        <w:t xml:space="preserve">% </w:t>
-      </w:r>
-      <w:proofErr w:type="spellStart"/>
-      <w:r>
-        <w:rPr>
-          <w:rFonts w:ascii="Arial" w:hAnsi="Arial"/>
-          <w:b/>
-          <w:color w:val="000000"/>
-          <w:sz w:val="20"/>
-        </w:rPr>
-        <w:t>if</w:t>
-      </w:r>
-      <w:proofErr w:type="spellEnd"/>
-      <w:r>
-        <w:rPr>
-          <w:rFonts w:ascii="Arial" w:hAnsi="Arial"/>
-          <w:b/>
-          <w:color w:val="000000"/>
-          <w:sz w:val="20"/>
-        </w:rPr>
-        <w:t xml:space="preserve"> </w:t>
-      </w:r>
-      <w:proofErr w:type="spellStart"/>
-      <w:r>
-        <w:rPr>
-          <w:rFonts w:ascii="Arial" w:hAnsi="Arial"/>
-          <w:b/>
-          <w:color w:val="000000"/>
-          <w:sz w:val="20"/>
-        </w:rPr>
-        <w:t>fiador_complemento</w:t>
-      </w:r>
-      <w:proofErr w:type="spellEnd"/>
-      <w:r>
-        <w:rPr>
-          <w:rFonts w:ascii="Arial" w:hAnsi="Arial"/>
-          <w:b/>
-          <w:color w:val="000000"/>
-          <w:sz w:val="20"/>
-        </w:rPr>
-        <w:t xml:space="preserve"> %} - </w:t>
-      </w:r>
-      <w:proofErr w:type="gramStart"/>
-      <w:r>
-        <w:rPr>
-          <w:rFonts w:ascii="Arial" w:hAnsi="Arial"/>
-          <w:b/>
-          <w:color w:val="000000"/>
-          <w:sz w:val="20"/>
-        </w:rPr>
-        <w:t xml:space="preserve">{{ </w:t>
-      </w:r>
-      <w:proofErr w:type="spellStart"/>
-      <w:r>
-        <w:rPr>
-          <w:rFonts w:ascii="Arial" w:hAnsi="Arial"/>
-          <w:b/>
-          <w:color w:val="000000"/>
-          <w:sz w:val="20"/>
-        </w:rPr>
-        <w:t>fiador</w:t>
-      </w:r>
-      <w:proofErr w:type="gramEnd"/>
-      <w:r>
-        <w:rPr>
-          <w:rFonts w:ascii="Arial" w:hAnsi="Arial"/>
-          <w:b/>
-          <w:color w:val="000000"/>
-          <w:sz w:val="20"/>
-        </w:rPr>
-        <w:t>_</w:t>
-      </w:r>
-      <w:proofErr w:type="gramStart"/>
-      <w:r>
-        <w:rPr>
-          <w:rFonts w:ascii="Arial" w:hAnsi="Arial"/>
-          <w:b/>
-          <w:color w:val="000000"/>
-          <w:sz w:val="20"/>
-        </w:rPr>
-        <w:t>complemento</w:t>
-      </w:r>
-      <w:proofErr w:type="spellEnd"/>
-      <w:r>
-        <w:rPr>
-          <w:rFonts w:ascii="Arial" w:hAnsi="Arial"/>
-          <w:b/>
-          <w:color w:val="000000"/>
-          <w:sz w:val="20"/>
-        </w:rPr>
-        <w:t xml:space="preserve"> }}{</w:t>
-      </w:r>
-      <w:proofErr w:type="gramEnd"/>
-      <w:r>
-        <w:rPr>
-          <w:rFonts w:ascii="Arial" w:hAnsi="Arial"/>
-          <w:b/>
-          <w:color w:val="000000"/>
-          <w:sz w:val="20"/>
-        </w:rPr>
-        <w:t xml:space="preserve">% </w:t>
-      </w:r>
-      <w:proofErr w:type="spellStart"/>
-      <w:r>
-        <w:rPr>
-          <w:rFonts w:ascii="Arial" w:hAnsi="Arial"/>
-          <w:b/>
-          <w:color w:val="000000"/>
-          <w:sz w:val="20"/>
-        </w:rPr>
-        <w:t>endif</w:t>
-      </w:r>
-      <w:proofErr w:type="spellEnd"/>
-      <w:r>
-        <w:rPr>
-          <w:rFonts w:ascii="Arial" w:hAnsi="Arial"/>
-          <w:b/>
-          <w:color w:val="000000"/>
-          <w:sz w:val="20"/>
-        </w:rPr>
-        <w:t xml:space="preserve"> %}</w:t>
-      </w:r>
-      <w:r>
-        <w:rPr>
-          <w:rFonts w:ascii="Arial" w:hAnsi="Arial"/>
-          <w:b/>
-          <w:color w:val="000000"/>
-          <w:sz w:val="20"/>
-        </w:rPr>
-        <w:t xml:space="preserve"> - </w:t>
-      </w:r>
-      <w:r>
-        <w:rPr>
-          <w:rFonts w:ascii="Arial" w:hAnsi="Arial"/>
-          <w:b/>
-          <w:color w:val="000000"/>
-          <w:sz w:val="20"/>
-        </w:rPr>
-        <w:t xml:space="preserve">Bairro </w:t>
-      </w:r>
-      <w:proofErr w:type="gramStart"/>
-      <w:r>
-        <w:rPr>
-          <w:rFonts w:ascii="Arial" w:hAnsi="Arial"/>
-          <w:b/>
-          <w:color w:val="000000"/>
-          <w:sz w:val="20"/>
-        </w:rPr>
-        <w:t xml:space="preserve">{{ </w:t>
-      </w:r>
-      <w:proofErr w:type="spellStart"/>
-      <w:r>
-        <w:rPr>
-          <w:rFonts w:ascii="Arial" w:hAnsi="Arial"/>
-          <w:b/>
-          <w:color w:val="000000"/>
-          <w:sz w:val="20"/>
-        </w:rPr>
-        <w:t>fiador</w:t>
-      </w:r>
-      <w:proofErr w:type="gramEnd"/>
-      <w:r>
-        <w:rPr>
-          <w:rFonts w:ascii="Arial" w:hAnsi="Arial"/>
-          <w:b/>
-          <w:color w:val="000000"/>
-          <w:sz w:val="20"/>
-        </w:rPr>
-        <w:t>_</w:t>
-      </w:r>
-      <w:proofErr w:type="gramStart"/>
-      <w:r>
-        <w:rPr>
-          <w:rFonts w:ascii="Arial" w:hAnsi="Arial"/>
-          <w:b/>
-          <w:color w:val="000000"/>
-          <w:sz w:val="20"/>
-        </w:rPr>
-        <w:t>bairro</w:t>
-      </w:r>
-      <w:proofErr w:type="spellEnd"/>
-      <w:r>
-        <w:rPr>
-          <w:rFonts w:ascii="Arial" w:hAnsi="Arial"/>
-          <w:b/>
-          <w:color w:val="000000"/>
-          <w:sz w:val="20"/>
-        </w:rPr>
-        <w:t xml:space="preserve"> }</w:t>
-      </w:r>
-      <w:proofErr w:type="gramEnd"/>
-      <w:r>
-        <w:rPr>
-          <w:rFonts w:ascii="Arial" w:hAnsi="Arial"/>
-          <w:b/>
-          <w:color w:val="000000"/>
-          <w:sz w:val="20"/>
-        </w:rPr>
-        <w:t xml:space="preserve">} – </w:t>
-      </w:r>
-      <w:proofErr w:type="gramStart"/>
-      <w:r>
-        <w:rPr>
-          <w:rFonts w:ascii="Arial" w:hAnsi="Arial"/>
-          <w:b/>
-          <w:color w:val="000000"/>
-          <w:sz w:val="20"/>
-        </w:rPr>
-        <w:t xml:space="preserve">{{ </w:t>
-      </w:r>
-      <w:proofErr w:type="spellStart"/>
-      <w:r>
-        <w:rPr>
-          <w:rFonts w:ascii="Arial" w:hAnsi="Arial"/>
-          <w:b/>
-          <w:color w:val="000000"/>
-          <w:sz w:val="20"/>
-        </w:rPr>
-        <w:t>fiador</w:t>
-      </w:r>
-      <w:proofErr w:type="gramEnd"/>
-      <w:r>
-        <w:rPr>
-          <w:rFonts w:ascii="Arial" w:hAnsi="Arial"/>
-          <w:b/>
-          <w:color w:val="000000"/>
-          <w:sz w:val="20"/>
-        </w:rPr>
-        <w:t>_</w:t>
-      </w:r>
-      <w:proofErr w:type="gramStart"/>
-      <w:r>
-        <w:rPr>
-          <w:rFonts w:ascii="Arial" w:hAnsi="Arial"/>
-          <w:b/>
-          <w:color w:val="000000"/>
-          <w:sz w:val="20"/>
-        </w:rPr>
-        <w:t>cidade</w:t>
-      </w:r>
-      <w:proofErr w:type="spellEnd"/>
-      <w:r>
-        <w:rPr>
-          <w:rFonts w:ascii="Arial" w:hAnsi="Arial"/>
-          <w:b/>
-          <w:color w:val="000000"/>
-          <w:sz w:val="20"/>
-        </w:rPr>
-        <w:t xml:space="preserve"> }</w:t>
-      </w:r>
-      <w:proofErr w:type="gramEnd"/>
-      <w:r>
-        <w:rPr>
-          <w:rFonts w:ascii="Arial" w:hAnsi="Arial"/>
-          <w:b/>
-          <w:color w:val="000000"/>
-          <w:sz w:val="20"/>
-        </w:rPr>
-        <w:t xml:space="preserve">} – </w:t>
-      </w:r>
-      <w:proofErr w:type="gramStart"/>
-      <w:r>
-        <w:rPr>
-          <w:rFonts w:ascii="Arial" w:hAnsi="Arial"/>
-          <w:b/>
-          <w:color w:val="000000"/>
-          <w:sz w:val="20"/>
-        </w:rPr>
-        <w:t xml:space="preserve">{{ </w:t>
-      </w:r>
-      <w:proofErr w:type="spellStart"/>
-      <w:r>
-        <w:rPr>
-          <w:rFonts w:ascii="Arial" w:hAnsi="Arial"/>
-          <w:b/>
-          <w:color w:val="000000"/>
-          <w:sz w:val="20"/>
-        </w:rPr>
-        <w:t>fiador</w:t>
-      </w:r>
-      <w:proofErr w:type="gramEnd"/>
-      <w:r>
-        <w:rPr>
-          <w:rFonts w:ascii="Arial" w:hAnsi="Arial"/>
-          <w:b/>
-          <w:color w:val="000000"/>
-          <w:sz w:val="20"/>
-        </w:rPr>
-        <w:t>_</w:t>
-      </w:r>
-      <w:proofErr w:type="gramStart"/>
-      <w:r>
-        <w:rPr>
-          <w:rFonts w:ascii="Arial" w:hAnsi="Arial"/>
-          <w:b/>
-          <w:color w:val="000000"/>
-          <w:sz w:val="20"/>
-        </w:rPr>
-        <w:t>uf</w:t>
-      </w:r>
-      <w:proofErr w:type="spellEnd"/>
-      <w:r>
-        <w:rPr>
-          <w:rFonts w:ascii="Arial" w:hAnsi="Arial"/>
-          <w:b/>
-          <w:color w:val="000000"/>
-          <w:sz w:val="20"/>
-        </w:rPr>
-        <w:t xml:space="preserve"> }</w:t>
-      </w:r>
-      <w:proofErr w:type="gramEnd"/>
-      <w:r>
-        <w:rPr>
-          <w:rFonts w:ascii="Arial" w:hAnsi="Arial"/>
-          <w:b/>
-          <w:color w:val="000000"/>
-          <w:sz w:val="20"/>
-        </w:rPr>
-        <w:t xml:space="preserve">} – CEP: </w:t>
-      </w:r>
-      <w:proofErr w:type="gramStart"/>
-      <w:r>
-        <w:rPr>
-          <w:rFonts w:ascii="Arial" w:hAnsi="Arial"/>
-          <w:b/>
-          <w:color w:val="000000"/>
-          <w:sz w:val="20"/>
-        </w:rPr>
-        <w:t xml:space="preserve">{{ </w:t>
-      </w:r>
-      <w:proofErr w:type="spellStart"/>
-      <w:r>
-        <w:rPr>
-          <w:rFonts w:ascii="Arial" w:hAnsi="Arial"/>
-          <w:b/>
-          <w:color w:val="000000"/>
-          <w:sz w:val="20"/>
-        </w:rPr>
-        <w:t>fiador</w:t>
-      </w:r>
-      <w:proofErr w:type="gramEnd"/>
-      <w:r>
-        <w:rPr>
-          <w:rFonts w:ascii="Arial" w:hAnsi="Arial"/>
-          <w:b/>
-          <w:color w:val="000000"/>
-          <w:sz w:val="20"/>
-        </w:rPr>
-        <w:t>_</w:t>
-      </w:r>
-      <w:proofErr w:type="gramStart"/>
-      <w:r>
-        <w:rPr>
-          <w:rFonts w:ascii="Arial" w:hAnsi="Arial"/>
-          <w:b/>
-          <w:color w:val="000000"/>
-          <w:sz w:val="20"/>
-        </w:rPr>
-        <w:t>cep</w:t>
-      </w:r>
-      <w:proofErr w:type="spellEnd"/>
-      <w:r>
-        <w:rPr>
-          <w:rFonts w:ascii="Arial" w:hAnsi="Arial"/>
-          <w:b/>
-          <w:color w:val="000000"/>
-          <w:sz w:val="20"/>
-        </w:rPr>
-        <w:t xml:space="preserve"> }</w:t>
-      </w:r>
-      <w:proofErr w:type="gramEnd"/>
-      <w:r>
-        <w:rPr>
-          <w:rFonts w:ascii="Arial" w:hAnsi="Arial"/>
-          <w:b/>
-          <w:color w:val="000000"/>
-          <w:sz w:val="20"/>
-        </w:rPr>
-        <w:t>}</w:t>
+      <w:r>
+        <w:rPr>
+          <w:rFonts w:ascii="Arial" w:hAnsi="Arial"/>
+          <w:b/>
+          <w:color w:val="000000"/>
+          <w:sz w:val="20"/>
+        </w:rPr>
+        <w:t xml:space="preserve">AVALISTA(S): Nome: {{ f.Fiador }} - CPF: {{ f.fiador_cpf }}</w:t>
+      </w:r>
+    </w:p>
+    <w:p>
+      <w:pPr>
+        <w:pStyle w:val="Standard"/>
+        <w:jc w:val="both"/>
+        <w:rPr>
+          <w:rFonts w:ascii="Arial" w:hAnsi="Arial"/>
+          <w:b/>
+          <w:color w:val="000000"/>
+          <w:sz w:val="20"/>
+        </w:rPr>
+      </w:pPr>
+      <w:r>
+        <w:rPr>
+          <w:rFonts w:ascii="Arial" w:hAnsi="Arial"/>
+          <w:b/>
+          <w:color w:val="000000"/>
+          <w:sz w:val="20"/>
+        </w:rPr>
+        <w:t xml:space="preserve">{{ f.fiador_endereco }}, nº {{ f.fiador_num_endereco }}{% if f.fiador_complemento %} - {{ f.fiador_complemento }}{% endif %} - Bairro {{ f.fiador_bairro }} – {{ f.fiador_cidade }} – {{ f.fiador_uf }} – CEP: {{ f.fiador_cep }}</w:t>
+      </w:r>
+    </w:p>
+    <w:p>
+      <w:pPr>
+        <w:pStyle w:val="Standard"/>
+        <w:jc w:val="both"/>
+        <w:rPr>
+          <w:rFonts w:ascii="Arial" w:hAnsi="Arial"/>
+          <w:b/>
+          <w:color w:val="000000"/>
+          <w:sz w:val="20"/>
+        </w:rPr>
+      </w:pPr>
+    </w:p>
+    <w:p>
+      <w:pPr>
+        <w:pStyle w:val="Standard"/>
+        <w:jc w:val="both"/>
+        <w:rPr>
+          <w:rFonts w:ascii="Arial" w:hAnsi="Arial"/>
+          <w:b/>
+          <w:color w:val="000000"/>
+          <w:sz w:val="20"/>
+        </w:rPr>
+      </w:pPr>
+      <w:r>
+        <w:rPr>
+          <w:rFonts w:ascii="Arial" w:hAnsi="Arial"/>
+          <w:b/>
+          <w:color w:val="000000"/>
+          <w:sz w:val="20"/>
+        </w:rPr>
+        <w:t xml:space="preserve">{%p endfor %}</w:t>
       </w:r>
     </w:p>
     <w:p>

</xml_diff>